<commit_message>
Update Fort Dix dispatch: add sidewalk section, incorporate Bilal's edits
- Add sidewalk section after window repair: jackhammering functional
  concrete while real failures go unaddressed — restores the 'fixing
  things that aren't broken' thesis
- Big Spring: add 'half housing units shuttered before I arrived' detail
- Add 'I came to realize Fort Dix was not a bad facility' from Big Spring
- Combine Fort Dix/Big Spring comparison sentences
- Remove settlement specifics from Big Spring section

Co-Authored-By: Claude Sonnet 4.6 <noreply@anthropic.com>
Claude-Session: https://claude.ai/code/session_015RE4AKHUoaX39pobuT8oag
</commit_message>
<xml_diff>
--- a/content/substack/fort-dix-too-big-to-fail.docx
+++ b/content/substack/fort-dix-too-big-to-fail.docx
@@ -332,6 +332,56 @@
           <w:i w:val="0"/>
           <w:sz w:val="22"/>
         </w:rPr>
+        <w:t>Around the same time, a crew arrived outside with jackhammers.</w:t>
+      </w:r>
+    </w:p>
+    <w:p>
+      <w:pPr>
+        <w:spacing w:after="160" w:before="0"/>
+      </w:pPr>
+      <w:r>
+        <w:rPr>
+          <w:rFonts w:ascii="Calibri" w:hAnsi="Calibri"/>
+          <w:b w:val="0"/>
+          <w:i w:val="0"/>
+          <w:sz w:val="22"/>
+        </w:rPr>
+        <w:t>The sidewalk they were tearing up had surface cracks — the kind any concrete develops over twenty years. The kind you patch in an afternoon with a bag of compound. They jackhammered the whole run and poured fresh. Then came back the next morning and extended the project another thirty feet.</w:t>
+      </w:r>
+    </w:p>
+    <w:p>
+      <w:pPr>
+        <w:spacing w:after="160" w:before="0"/>
+      </w:pPr>
+      <w:r>
+        <w:rPr>
+          <w:rFonts w:ascii="Calibri" w:hAnsi="Calibri"/>
+          <w:b w:val="0"/>
+          <w:i w:val="0"/>
+          <w:sz w:val="22"/>
+        </w:rPr>
+        <w:t>That money came from somewhere. It did not come from fixing what is actually broken.</w:t>
+      </w:r>
+    </w:p>
+    <w:p>
+      <w:pPr>
+        <w:spacing w:before="120" w:after="120"/>
+        <w:pBdr>
+          <w:bottom w:val="single" w:sz="4" w:space="1" w:color="CCCCCC"/>
+        </w:pBdr>
+      </w:pPr>
+    </w:p>
+    <w:p>
+      <w:pPr>
+        <w:spacing w:after="160" w:before="0"/>
+      </w:pPr>
+      <w:r>
+        <w:rPr>
+          <w:rFonts w:ascii="Calibri" w:hAnsi="Calibri"/>
+          <w:b w:val="0"/>
+          <w:i w:val="0"/>
+          <w:sz w:val="22"/>
+        </w:rPr>
         <w:t>Every time I walk to chow, to rec, to health services, to education — to anywhere on this compound — I pass within six feet of a condemned building. There is a hard hat required sign posted between the sidewalk and the wall. Bricks fall off it.</w:t>
       </w:r>
     </w:p>
@@ -553,7 +603,7 @@
           <w:i w:val="0"/>
           <w:sz w:val="22"/>
         </w:rPr>
-        <w:t>I know Big Spring. After I sued the BOP, they transferred me there. I litigated that transfer with the help of Cole Schotz attorneys on a pro bono basis. The government transferred me back to Fort Dix. The settlement requires the BOP to show cause and give advance notice before any future transfer of mine — an outcome that, as far as anyone can document, is exceedingly rare in BOP history. Possibly unique.</w:t>
+        <w:t>I know Big Spring. After I sued the BOP, they transferred me there. I litigated that transfer with the help of Cole Schotz attorneys on a pro bono basis. The government transferred me back to Fort Dix. While at Big Spring, I came to realize that Fort Dix was not a bad facility.</w:t>
       </w:r>
     </w:p>
     <w:p>
@@ -567,7 +617,7 @@
           <w:i w:val="0"/>
           <w:sz w:val="22"/>
         </w:rPr>
-        <w:t>Big Spring was in far worse condition than Fort Dix. And it was closed for infrastructure failures.</w:t>
+        <w:t>Big Spring was in far worse condition than Fort Dix. And it was closed for infrastructure failures; before I arrived there, half of the housing units were shuttered.</w:t>
       </w:r>
     </w:p>
     <w:p>
@@ -581,21 +631,7 @@
           <w:i w:val="0"/>
           <w:sz w:val="22"/>
         </w:rPr>
-        <w:t>Fort Dix is in better shape than Big Spring was.</w:t>
-      </w:r>
-    </w:p>
-    <w:p>
-      <w:pPr>
-        <w:spacing w:after="160" w:before="0"/>
-      </w:pPr>
-      <w:r>
-        <w:rPr>
-          <w:rFonts w:ascii="Calibri" w:hAnsi="Calibri"/>
-          <w:b w:val="0"/>
-          <w:i w:val="0"/>
-          <w:sz w:val="22"/>
-        </w:rPr>
-        <w:t>Fort Dix also cannot be closed.</w:t>
+        <w:t>Fort Dix is in better shape than Big Spring was but even if it wasn't, it cannot be closed.</w:t>
       </w:r>
     </w:p>
     <w:p>

</xml_diff>